<commit_message>
agui moved to last
</commit_message>
<xml_diff>
--- a/Build_real_world_agents/FastAPI app/docs/FastAPI_Doc.docx
+++ b/Build_real_world_agents/FastAPI app/docs/FastAPI_Doc.docx
@@ -141,7 +141,7 @@
         <w:rPr>
           <w:rtl w:val="0"/>
         </w:rPr>
-        <w:t xml:space="preserve">Changes on existing code</w:t>
+        <w:t xml:space="preserve">1. Changes on existing code</w:t>
       </w:r>
     </w:p>
     <w:p>
@@ -422,12 +422,12 @@
           <wp:inline distB="114300" distT="114300" distL="114300" distR="114300">
             <wp:extent cx="6119820" cy="2781300"/>
             <wp:effectExtent b="0" l="0" r="0" t="0"/>
-            <wp:docPr id="1" name="image2.jpg"/>
+            <wp:docPr id="1" name="image1.jpg"/>
             <a:graphic>
               <a:graphicData uri="http://schemas.openxmlformats.org/drawingml/2006/picture">
                 <pic:pic>
                   <pic:nvPicPr>
-                    <pic:cNvPr id="0" name="image2.jpg"/>
+                    <pic:cNvPr id="0" name="image1.jpg"/>
                     <pic:cNvPicPr preferRelativeResize="0"/>
                   </pic:nvPicPr>
                   <pic:blipFill>
@@ -462,10 +462,17 @@
         <w:pStyle w:val="Heading2"/>
         <w:spacing w:line="276" w:lineRule="auto"/>
         <w:ind w:left="0" w:firstLine="0"/>
-        <w:rPr/>
-      </w:pPr>
-      <w:r>
-        <w:rPr>
+        <w:rPr>
+          <w:sz w:val="28"/>
+          <w:szCs w:val="28"/>
+          <w:u w:val="single"/>
+        </w:rPr>
+      </w:pPr>
+      <w:r>
+        <w:rPr>
+          <w:sz w:val="28"/>
+          <w:szCs w:val="28"/>
+          <w:u w:val="single"/>
           <w:rtl w:val="0"/>
         </w:rPr>
         <w:t xml:space="preserve">Requirements</w:t>
@@ -572,10 +579,16 @@
         </w:numPr>
         <w:spacing w:line="276" w:lineRule="auto"/>
         <w:ind w:left="0" w:firstLine="0"/>
-        <w:rPr/>
-      </w:pPr>
-      <w:r>
-        <w:rPr>
+        <w:rPr>
+          <w:sz w:val="28"/>
+          <w:szCs w:val="28"/>
+        </w:rPr>
+      </w:pPr>
+      <w:r>
+        <w:rPr>
+          <w:sz w:val="28"/>
+          <w:szCs w:val="28"/>
+          <w:u w:val="single"/>
           <w:rtl w:val="0"/>
         </w:rPr>
         <w:t xml:space="preserve">Run Locally</w:t>
@@ -752,10 +765,16 @@
         </w:numPr>
         <w:spacing w:line="276" w:lineRule="auto"/>
         <w:ind w:left="0" w:firstLine="0"/>
-        <w:rPr/>
-      </w:pPr>
-      <w:r>
-        <w:rPr>
+        <w:rPr>
+          <w:sz w:val="28"/>
+          <w:szCs w:val="28"/>
+        </w:rPr>
+      </w:pPr>
+      <w:r>
+        <w:rPr>
+          <w:sz w:val="28"/>
+          <w:szCs w:val="28"/>
+          <w:u w:val="single"/>
           <w:rtl w:val="0"/>
         </w:rPr>
         <w:t xml:space="preserve">API Endpoints</w:t>
@@ -1033,344 +1052,11 @@
     <w:p>
       <w:pPr>
         <w:pStyle w:val="Heading3"/>
-        <w:numPr>
-          <w:ilvl w:val="2"/>
-          <w:numId w:val="1"/>
-        </w:numPr>
-        <w:spacing w:line="276" w:lineRule="auto"/>
-        <w:ind w:left="0" w:firstLine="0"/>
-        <w:rPr/>
-      </w:pPr>
-      <w:r>
-        <w:rPr>
-          <w:rtl w:val="0"/>
-        </w:rPr>
-      </w:r>
-    </w:p>
-    <w:p>
-      <w:pPr>
-        <w:pStyle w:val="Heading3"/>
-        <w:numPr>
-          <w:ilvl w:val="2"/>
-          <w:numId w:val="1"/>
-        </w:numPr>
-        <w:spacing w:line="276" w:lineRule="auto"/>
-        <w:ind w:left="0" w:firstLine="0"/>
-        <w:rPr/>
-      </w:pPr>
-      <w:r>
-        <w:rPr>
-          <w:rtl w:val="0"/>
-        </w:rPr>
-        <w:t xml:space="preserve">Chat (AG-UI)</w:t>
-      </w:r>
-    </w:p>
-    <w:p>
-      <w:pPr>
-        <w:keepNext w:val="0"/>
-        <w:keepLines w:val="0"/>
-        <w:pageBreakBefore w:val="0"/>
-        <w:widowControl w:val="0"/>
-        <w:numPr>
-          <w:ilvl w:val="0"/>
-          <w:numId w:val="4"/>
-        </w:numPr>
-        <w:pBdr>
-          <w:top w:space="0" w:sz="0" w:val="nil"/>
-          <w:left w:space="0" w:sz="0" w:val="nil"/>
-          <w:bottom w:space="0" w:sz="0" w:val="nil"/>
-          <w:right w:space="0" w:sz="0" w:val="nil"/>
-          <w:between w:space="0" w:sz="0" w:val="nil"/>
-        </w:pBdr>
-        <w:shd w:fill="auto" w:val="clear"/>
-        <w:tabs>
-          <w:tab w:val="left" w:leader="none" w:pos="709"/>
-        </w:tabs>
-        <w:spacing w:after="140" w:before="0" w:line="276" w:lineRule="auto"/>
-        <w:ind w:left="709" w:right="0" w:hanging="283"/>
-        <w:jc w:val="left"/>
-        <w:rPr>
-          <w:b w:val="0"/>
-          <w:bCs w:val="0"/>
-          <w:i w:val="0"/>
-          <w:iCs w:val="0"/>
-          <w:smallCaps w:val="0"/>
-          <w:strike w:val="0"/>
-          <w:color w:val="000000"/>
-          <w:sz w:val="24"/>
-          <w:szCs w:val="24"/>
-          <w:u w:val="none"/>
-          <w:shd w:fill="auto" w:val="clear"/>
-          <w:vertAlign w:val="baseline"/>
-        </w:rPr>
-      </w:pPr>
-      <w:r>
-        <w:rPr>
-          <w:rFonts w:ascii="Liberation Serif" w:cs="Liberation Serif" w:eastAsia="Liberation Serif" w:hAnsi="Liberation Serif"/>
-          <w:b w:val="0"/>
-          <w:bCs w:val="0"/>
-          <w:i w:val="0"/>
-          <w:iCs w:val="0"/>
-          <w:smallCaps w:val="0"/>
-          <w:strike w:val="0"/>
-          <w:color w:val="000000"/>
-          <w:sz w:val="24"/>
-          <w:szCs w:val="24"/>
-          <w:u w:val="none"/>
-          <w:shd w:fill="auto" w:val="clear"/>
-          <w:vertAlign w:val="baseline"/>
-          <w:rtl w:val="0"/>
-        </w:rPr>
-        <w:t xml:space="preserve">Method: </w:t>
-      </w:r>
-      <w:r>
-        <w:rPr>
-          <w:rFonts w:ascii="Liberation Mono" w:cs="Liberation Mono" w:eastAsia="Liberation Mono" w:hAnsi="Liberation Mono"/>
-          <w:b w:val="0"/>
-          <w:bCs w:val="0"/>
-          <w:i w:val="0"/>
-          <w:iCs w:val="0"/>
-          <w:smallCaps w:val="0"/>
-          <w:strike w:val="0"/>
-          <w:color w:val="000000"/>
-          <w:sz w:val="24"/>
-          <w:szCs w:val="24"/>
-          <w:u w:val="none"/>
-          <w:shd w:fill="auto" w:val="clear"/>
-          <w:vertAlign w:val="baseline"/>
-          <w:rtl w:val="0"/>
-        </w:rPr>
-        <w:t xml:space="preserve">POST</w:t>
-      </w:r>
-      <w:r>
-        <w:rPr>
-          <w:rtl w:val="0"/>
-        </w:rPr>
-      </w:r>
-    </w:p>
-    <w:p>
-      <w:pPr>
-        <w:keepNext w:val="0"/>
-        <w:keepLines w:val="0"/>
-        <w:pageBreakBefore w:val="0"/>
-        <w:widowControl w:val="0"/>
-        <w:numPr>
-          <w:ilvl w:val="0"/>
-          <w:numId w:val="4"/>
-        </w:numPr>
-        <w:pBdr>
-          <w:top w:space="0" w:sz="0" w:val="nil"/>
-          <w:left w:space="0" w:sz="0" w:val="nil"/>
-          <w:bottom w:space="0" w:sz="0" w:val="nil"/>
-          <w:right w:space="0" w:sz="0" w:val="nil"/>
-          <w:between w:space="0" w:sz="0" w:val="nil"/>
-        </w:pBdr>
-        <w:shd w:fill="auto" w:val="clear"/>
-        <w:tabs>
-          <w:tab w:val="left" w:leader="none" w:pos="709"/>
-        </w:tabs>
-        <w:spacing w:after="140" w:before="0" w:line="276" w:lineRule="auto"/>
-        <w:ind w:left="709" w:right="0" w:hanging="283"/>
-        <w:jc w:val="left"/>
-        <w:rPr>
-          <w:b w:val="0"/>
-          <w:bCs w:val="0"/>
-          <w:i w:val="0"/>
-          <w:iCs w:val="0"/>
-          <w:smallCaps w:val="0"/>
-          <w:strike w:val="0"/>
-          <w:color w:val="000000"/>
-          <w:sz w:val="24"/>
-          <w:szCs w:val="24"/>
-          <w:u w:val="none"/>
-          <w:shd w:fill="auto" w:val="clear"/>
-          <w:vertAlign w:val="baseline"/>
-        </w:rPr>
-      </w:pPr>
-      <w:r>
-        <w:rPr>
-          <w:rFonts w:ascii="Liberation Serif" w:cs="Liberation Serif" w:eastAsia="Liberation Serif" w:hAnsi="Liberation Serif"/>
-          <w:b w:val="0"/>
-          <w:bCs w:val="0"/>
-          <w:i w:val="0"/>
-          <w:iCs w:val="0"/>
-          <w:smallCaps w:val="0"/>
-          <w:strike w:val="0"/>
-          <w:color w:val="000000"/>
-          <w:sz w:val="24"/>
-          <w:szCs w:val="24"/>
-          <w:u w:val="none"/>
-          <w:shd w:fill="auto" w:val="clear"/>
-          <w:vertAlign w:val="baseline"/>
-          <w:rtl w:val="0"/>
-        </w:rPr>
-        <w:t xml:space="preserve">URL: </w:t>
-      </w:r>
-      <w:r>
-        <w:rPr>
-          <w:rFonts w:ascii="Liberation Mono" w:cs="Liberation Mono" w:eastAsia="Liberation Mono" w:hAnsi="Liberation Mono"/>
-          <w:b w:val="0"/>
-          <w:bCs w:val="0"/>
-          <w:i w:val="0"/>
-          <w:iCs w:val="0"/>
-          <w:smallCaps w:val="0"/>
-          <w:strike w:val="0"/>
-          <w:color w:val="000000"/>
-          <w:sz w:val="24"/>
-          <w:szCs w:val="24"/>
-          <w:u w:val="none"/>
-          <w:shd w:fill="auto" w:val="clear"/>
-          <w:vertAlign w:val="baseline"/>
-          <w:rtl w:val="0"/>
-        </w:rPr>
-        <w:t xml:space="preserve">/chat</w:t>
-      </w:r>
-      <w:r>
-        <w:rPr>
-          <w:rtl w:val="0"/>
-        </w:rPr>
-      </w:r>
-    </w:p>
-    <w:p>
-      <w:pPr>
-        <w:keepNext w:val="0"/>
-        <w:keepLines w:val="0"/>
-        <w:pageBreakBefore w:val="0"/>
-        <w:widowControl w:val="0"/>
-        <w:numPr>
-          <w:ilvl w:val="0"/>
-          <w:numId w:val="4"/>
-        </w:numPr>
-        <w:pBdr>
-          <w:top w:space="0" w:sz="0" w:val="nil"/>
-          <w:left w:space="0" w:sz="0" w:val="nil"/>
-          <w:bottom w:space="0" w:sz="0" w:val="nil"/>
-          <w:right w:space="0" w:sz="0" w:val="nil"/>
-          <w:between w:space="0" w:sz="0" w:val="nil"/>
-        </w:pBdr>
-        <w:shd w:fill="auto" w:val="clear"/>
-        <w:tabs>
-          <w:tab w:val="left" w:leader="none" w:pos="709"/>
-        </w:tabs>
-        <w:spacing w:after="140" w:before="0" w:line="276" w:lineRule="auto"/>
-        <w:ind w:left="709" w:right="0" w:hanging="283"/>
-        <w:jc w:val="left"/>
-        <w:rPr>
-          <w:b w:val="0"/>
-          <w:bCs w:val="0"/>
-          <w:i w:val="0"/>
-          <w:iCs w:val="0"/>
-          <w:smallCaps w:val="0"/>
-          <w:strike w:val="0"/>
-          <w:color w:val="000000"/>
-          <w:sz w:val="24"/>
-          <w:szCs w:val="24"/>
-          <w:u w:val="none"/>
-          <w:shd w:fill="auto" w:val="clear"/>
-          <w:vertAlign w:val="baseline"/>
-        </w:rPr>
-      </w:pPr>
-      <w:r>
-        <w:rPr>
-          <w:rFonts w:ascii="Liberation Serif" w:cs="Liberation Serif" w:eastAsia="Liberation Serif" w:hAnsi="Liberation Serif"/>
-          <w:b w:val="0"/>
-          <w:bCs w:val="0"/>
-          <w:i w:val="0"/>
-          <w:iCs w:val="0"/>
-          <w:smallCaps w:val="0"/>
-          <w:strike w:val="0"/>
-          <w:color w:val="000000"/>
-          <w:sz w:val="24"/>
-          <w:szCs w:val="24"/>
-          <w:u w:val="none"/>
-          <w:shd w:fill="auto" w:val="clear"/>
-          <w:vertAlign w:val="baseline"/>
-          <w:rtl w:val="0"/>
-        </w:rPr>
-        <w:t xml:space="preserve">Protocol: Server-Sent Events for </w:t>
-      </w:r>
-      <w:r>
-        <w:rPr>
-          <w:rFonts w:ascii="Liberation Mono" w:cs="Liberation Mono" w:eastAsia="Liberation Mono" w:hAnsi="Liberation Mono"/>
-          <w:b w:val="0"/>
-          <w:bCs w:val="0"/>
-          <w:i w:val="0"/>
-          <w:iCs w:val="0"/>
-          <w:smallCaps w:val="0"/>
-          <w:strike w:val="0"/>
-          <w:color w:val="000000"/>
-          <w:sz w:val="24"/>
-          <w:szCs w:val="24"/>
-          <w:u w:val="none"/>
-          <w:shd w:fill="auto" w:val="clear"/>
-          <w:vertAlign w:val="baseline"/>
-          <w:rtl w:val="0"/>
-        </w:rPr>
-        <w:t xml:space="preserve">AGUIChatClient</w:t>
-      </w:r>
-      <w:r>
-        <w:rPr>
-          <w:rFonts w:ascii="Liberation Serif" w:cs="Liberation Serif" w:eastAsia="Liberation Serif" w:hAnsi="Liberation Serif"/>
-          <w:b w:val="0"/>
-          <w:bCs w:val="0"/>
-          <w:i w:val="0"/>
-          <w:iCs w:val="0"/>
-          <w:smallCaps w:val="0"/>
-          <w:strike w:val="0"/>
-          <w:color w:val="000000"/>
-          <w:sz w:val="24"/>
-          <w:szCs w:val="24"/>
-          <w:u w:val="none"/>
-          <w:shd w:fill="auto" w:val="clear"/>
-          <w:vertAlign w:val="baseline"/>
-          <w:rtl w:val="0"/>
-        </w:rPr>
-        <w:t xml:space="preserve">.</w:t>
-      </w:r>
-    </w:p>
-    <w:p>
-      <w:pPr>
-        <w:pStyle w:val="Heading2"/>
         <w:spacing w:line="276" w:lineRule="auto"/>
         <w:rPr/>
       </w:pPr>
-      <w:bookmarkStart w:colFirst="0" w:colLast="0" w:name="_istvrb9bvscs" w:id="1"/>
+      <w:bookmarkStart w:colFirst="0" w:colLast="0" w:name="_crioccl3nd6" w:id="1"/>
       <w:bookmarkEnd w:id="1"/>
-      <w:r>
-        <w:rPr/>
-        <w:drawing>
-          <wp:inline distB="114300" distT="114300" distL="114300" distR="114300">
-            <wp:extent cx="6124575" cy="2609842"/>
-            <wp:effectExtent b="0" l="0" r="0" t="0"/>
-            <wp:docPr id="3" name="image3.jpg"/>
-            <a:graphic>
-              <a:graphicData uri="http://schemas.openxmlformats.org/drawingml/2006/picture">
-                <pic:pic>
-                  <pic:nvPicPr>
-                    <pic:cNvPr id="0" name="image3.jpg"/>
-                    <pic:cNvPicPr preferRelativeResize="0"/>
-                  </pic:nvPicPr>
-                  <pic:blipFill>
-                    <a:blip r:embed="rId7"/>
-                    <a:srcRect b="35982" l="0" r="0" t="0"/>
-                    <a:stretch>
-                      <a:fillRect/>
-                    </a:stretch>
-                  </pic:blipFill>
-                  <pic:spPr>
-                    <a:xfrm>
-                      <a:off x="0" y="0"/>
-                      <a:ext cx="6124575" cy="2609842"/>
-                    </a:xfrm>
-                    <a:prstGeom prst="rect"/>
-                    <a:ln/>
-                  </pic:spPr>
-                </pic:pic>
-              </a:graphicData>
-            </a:graphic>
-          </wp:inline>
-        </w:drawing>
-      </w:r>
       <w:r>
         <w:rPr>
           <w:rtl w:val="0"/>
@@ -1381,70 +1067,37 @@
       <w:pPr>
         <w:pStyle w:val="Heading3"/>
         <w:spacing w:line="276" w:lineRule="auto"/>
-        <w:ind w:left="0" w:firstLine="0"/>
         <w:rPr/>
       </w:pPr>
-      <w:r>
-        <w:rPr>
-          <w:rtl w:val="0"/>
-        </w:rPr>
-        <w:t xml:space="preserve">Chat (JSON fallback)</w:t>
-      </w:r>
-    </w:p>
-    <w:p>
-      <w:pPr>
-        <w:keepNext w:val="0"/>
-        <w:keepLines w:val="0"/>
-        <w:pageBreakBefore w:val="0"/>
-        <w:widowControl w:val="0"/>
+      <w:bookmarkStart w:colFirst="0" w:colLast="0" w:name="_93cra17ty2iy" w:id="2"/>
+      <w:bookmarkEnd w:id="2"/>
+      <w:r>
+        <w:rPr>
+          <w:rtl w:val="0"/>
+        </w:rPr>
+        <w:t xml:space="preserve">Chat </w:t>
+      </w:r>
+    </w:p>
+    <w:p>
+      <w:pPr>
         <w:numPr>
           <w:ilvl w:val="0"/>
           <w:numId w:val="5"/>
         </w:numPr>
-        <w:pBdr>
-          <w:top w:space="0" w:sz="0" w:val="nil"/>
-          <w:left w:space="0" w:sz="0" w:val="nil"/>
-          <w:bottom w:space="0" w:sz="0" w:val="nil"/>
-          <w:right w:space="0" w:sz="0" w:val="nil"/>
-          <w:between w:space="0" w:sz="0" w:val="nil"/>
-        </w:pBdr>
-        <w:shd w:fill="auto" w:val="clear"/>
         <w:tabs>
           <w:tab w:val="left" w:leader="none" w:pos="709"/>
         </w:tabs>
-        <w:spacing w:after="140" w:before="0" w:line="276" w:lineRule="auto"/>
-        <w:ind w:left="709" w:right="0" w:hanging="283"/>
-        <w:jc w:val="left"/>
-        <w:rPr>
-          <w:b w:val="0"/>
-          <w:bCs w:val="0"/>
-          <w:i w:val="0"/>
-          <w:iCs w:val="0"/>
-          <w:smallCaps w:val="0"/>
-          <w:strike w:val="0"/>
-          <w:color w:val="000000"/>
-          <w:sz w:val="24"/>
-          <w:szCs w:val="24"/>
-          <w:u w:val="none"/>
-          <w:shd w:fill="auto" w:val="clear"/>
-          <w:vertAlign w:val="baseline"/>
-        </w:rPr>
-      </w:pPr>
-      <w:r>
-        <w:rPr>
-          <w:rFonts w:ascii="Liberation Serif" w:cs="Liberation Serif" w:eastAsia="Liberation Serif" w:hAnsi="Liberation Serif"/>
-          <w:b w:val="0"/>
-          <w:bCs w:val="0"/>
-          <w:i w:val="0"/>
-          <w:iCs w:val="0"/>
-          <w:smallCaps w:val="0"/>
-          <w:strike w:val="0"/>
-          <w:color w:val="000000"/>
-          <w:sz w:val="24"/>
-          <w:szCs w:val="24"/>
-          <w:u w:val="none"/>
-          <w:shd w:fill="auto" w:val="clear"/>
-          <w:vertAlign w:val="baseline"/>
+        <w:spacing w:after="140" w:line="276" w:lineRule="auto"/>
+        <w:ind w:left="709" w:hanging="283"/>
+        <w:rPr>
+          <w:b w:val="0"/>
+          <w:bCs w:val="0"/>
+          <w:sz w:val="24"/>
+          <w:szCs w:val="24"/>
+        </w:rPr>
+      </w:pPr>
+      <w:r>
+        <w:rPr>
           <w:rtl w:val="0"/>
         </w:rPr>
         <w:t xml:space="preserve">Method: </w:t>
@@ -1452,18 +1105,6 @@
       <w:r>
         <w:rPr>
           <w:rFonts w:ascii="Liberation Mono" w:cs="Liberation Mono" w:eastAsia="Liberation Mono" w:hAnsi="Liberation Mono"/>
-          <w:b w:val="0"/>
-          <w:bCs w:val="0"/>
-          <w:i w:val="0"/>
-          <w:iCs w:val="0"/>
-          <w:smallCaps w:val="0"/>
-          <w:strike w:val="0"/>
-          <w:color w:val="000000"/>
-          <w:sz w:val="24"/>
-          <w:szCs w:val="24"/>
-          <w:u w:val="none"/>
-          <w:shd w:fill="auto" w:val="clear"/>
-          <w:vertAlign w:val="baseline"/>
           <w:rtl w:val="0"/>
         </w:rPr>
         <w:t xml:space="preserve">POST</w:t>
@@ -1476,58 +1117,24 @@
     </w:p>
     <w:p>
       <w:pPr>
-        <w:keepNext w:val="0"/>
-        <w:keepLines w:val="0"/>
-        <w:pageBreakBefore w:val="0"/>
-        <w:widowControl w:val="0"/>
         <w:numPr>
           <w:ilvl w:val="0"/>
           <w:numId w:val="5"/>
         </w:numPr>
-        <w:pBdr>
-          <w:top w:space="0" w:sz="0" w:val="nil"/>
-          <w:left w:space="0" w:sz="0" w:val="nil"/>
-          <w:bottom w:space="0" w:sz="0" w:val="nil"/>
-          <w:right w:space="0" w:sz="0" w:val="nil"/>
-          <w:between w:space="0" w:sz="0" w:val="nil"/>
-        </w:pBdr>
-        <w:shd w:fill="auto" w:val="clear"/>
         <w:tabs>
           <w:tab w:val="left" w:leader="none" w:pos="709"/>
         </w:tabs>
-        <w:spacing w:after="140" w:before="0" w:line="276" w:lineRule="auto"/>
-        <w:ind w:left="709" w:right="0" w:hanging="283"/>
-        <w:jc w:val="left"/>
-        <w:rPr>
-          <w:b w:val="0"/>
-          <w:bCs w:val="0"/>
-          <w:i w:val="0"/>
-          <w:iCs w:val="0"/>
-          <w:smallCaps w:val="0"/>
-          <w:strike w:val="0"/>
-          <w:color w:val="000000"/>
-          <w:sz w:val="24"/>
-          <w:szCs w:val="24"/>
-          <w:u w:val="none"/>
-          <w:shd w:fill="auto" w:val="clear"/>
-          <w:vertAlign w:val="baseline"/>
-        </w:rPr>
-      </w:pPr>
-      <w:r>
-        <w:rPr>
-          <w:rFonts w:ascii="Liberation Serif" w:cs="Liberation Serif" w:eastAsia="Liberation Serif" w:hAnsi="Liberation Serif"/>
-          <w:b w:val="0"/>
-          <w:bCs w:val="0"/>
-          <w:i w:val="0"/>
-          <w:iCs w:val="0"/>
-          <w:smallCaps w:val="0"/>
-          <w:strike w:val="0"/>
-          <w:color w:val="000000"/>
-          <w:sz w:val="24"/>
-          <w:szCs w:val="24"/>
-          <w:u w:val="none"/>
-          <w:shd w:fill="auto" w:val="clear"/>
-          <w:vertAlign w:val="baseline"/>
+        <w:spacing w:after="140" w:line="276" w:lineRule="auto"/>
+        <w:ind w:left="709" w:hanging="283"/>
+        <w:rPr>
+          <w:b w:val="0"/>
+          <w:bCs w:val="0"/>
+          <w:sz w:val="24"/>
+          <w:szCs w:val="24"/>
+        </w:rPr>
+      </w:pPr>
+      <w:r>
+        <w:rPr>
           <w:rtl w:val="0"/>
         </w:rPr>
         <w:t xml:space="preserve">URL: </w:t>
@@ -1535,18 +1142,6 @@
       <w:r>
         <w:rPr>
           <w:rFonts w:ascii="Liberation Mono" w:cs="Liberation Mono" w:eastAsia="Liberation Mono" w:hAnsi="Liberation Mono"/>
-          <w:b w:val="0"/>
-          <w:bCs w:val="0"/>
-          <w:i w:val="0"/>
-          <w:iCs w:val="0"/>
-          <w:smallCaps w:val="0"/>
-          <w:strike w:val="0"/>
-          <w:color w:val="000000"/>
-          <w:sz w:val="24"/>
-          <w:szCs w:val="24"/>
-          <w:u w:val="none"/>
-          <w:shd w:fill="auto" w:val="clear"/>
-          <w:vertAlign w:val="baseline"/>
           <w:rtl w:val="0"/>
         </w:rPr>
         <w:t xml:space="preserve">/chat-json</w:t>
@@ -1559,58 +1154,24 @@
     </w:p>
     <w:p>
       <w:pPr>
-        <w:keepNext w:val="0"/>
-        <w:keepLines w:val="0"/>
-        <w:pageBreakBefore w:val="0"/>
-        <w:widowControl w:val="0"/>
         <w:numPr>
           <w:ilvl w:val="0"/>
           <w:numId w:val="5"/>
         </w:numPr>
-        <w:pBdr>
-          <w:top w:space="0" w:sz="0" w:val="nil"/>
-          <w:left w:space="0" w:sz="0" w:val="nil"/>
-          <w:bottom w:space="0" w:sz="0" w:val="nil"/>
-          <w:right w:space="0" w:sz="0" w:val="nil"/>
-          <w:between w:space="0" w:sz="0" w:val="nil"/>
-        </w:pBdr>
-        <w:shd w:fill="auto" w:val="clear"/>
         <w:tabs>
           <w:tab w:val="left" w:leader="none" w:pos="709"/>
         </w:tabs>
-        <w:spacing w:after="140" w:before="0" w:line="276" w:lineRule="auto"/>
-        <w:ind w:left="709" w:right="0" w:hanging="283"/>
-        <w:jc w:val="left"/>
-        <w:rPr>
-          <w:b w:val="0"/>
-          <w:bCs w:val="0"/>
-          <w:i w:val="0"/>
-          <w:iCs w:val="0"/>
-          <w:smallCaps w:val="0"/>
-          <w:strike w:val="0"/>
-          <w:color w:val="000000"/>
-          <w:sz w:val="24"/>
-          <w:szCs w:val="24"/>
-          <w:u w:val="none"/>
-          <w:shd w:fill="auto" w:val="clear"/>
-          <w:vertAlign w:val="baseline"/>
-        </w:rPr>
-      </w:pPr>
-      <w:r>
-        <w:rPr>
-          <w:rFonts w:ascii="Liberation Serif" w:cs="Liberation Serif" w:eastAsia="Liberation Serif" w:hAnsi="Liberation Serif"/>
-          <w:b w:val="0"/>
-          <w:bCs w:val="0"/>
-          <w:i w:val="0"/>
-          <w:iCs w:val="0"/>
-          <w:smallCaps w:val="0"/>
-          <w:strike w:val="0"/>
-          <w:color w:val="000000"/>
-          <w:sz w:val="24"/>
-          <w:szCs w:val="24"/>
-          <w:u w:val="none"/>
-          <w:shd w:fill="auto" w:val="clear"/>
-          <w:vertAlign w:val="baseline"/>
+        <w:spacing w:after="140" w:line="276" w:lineRule="auto"/>
+        <w:ind w:left="709" w:hanging="283"/>
+        <w:rPr>
+          <w:b w:val="0"/>
+          <w:bCs w:val="0"/>
+          <w:sz w:val="24"/>
+          <w:szCs w:val="24"/>
+        </w:rPr>
+      </w:pPr>
+      <w:r>
+        <w:rPr>
           <w:rtl w:val="0"/>
         </w:rPr>
         <w:t xml:space="preserve">Body:</w:t>
@@ -1644,58 +1205,24 @@
     </w:p>
     <w:p>
       <w:pPr>
-        <w:keepNext w:val="0"/>
-        <w:keepLines w:val="0"/>
-        <w:pageBreakBefore w:val="0"/>
-        <w:widowControl w:val="0"/>
         <w:numPr>
           <w:ilvl w:val="0"/>
           <w:numId w:val="6"/>
         </w:numPr>
-        <w:pBdr>
-          <w:top w:space="0" w:sz="0" w:val="nil"/>
-          <w:left w:space="0" w:sz="0" w:val="nil"/>
-          <w:bottom w:space="0" w:sz="0" w:val="nil"/>
-          <w:right w:space="0" w:sz="0" w:val="nil"/>
-          <w:between w:space="0" w:sz="0" w:val="nil"/>
-        </w:pBdr>
-        <w:shd w:fill="auto" w:val="clear"/>
         <w:tabs>
           <w:tab w:val="left" w:leader="none" w:pos="709"/>
         </w:tabs>
-        <w:spacing w:after="140" w:before="0" w:line="276" w:lineRule="auto"/>
-        <w:ind w:left="709" w:right="0" w:hanging="283"/>
-        <w:jc w:val="left"/>
-        <w:rPr>
-          <w:b w:val="0"/>
-          <w:bCs w:val="0"/>
-          <w:i w:val="0"/>
-          <w:iCs w:val="0"/>
-          <w:smallCaps w:val="0"/>
-          <w:strike w:val="0"/>
-          <w:color w:val="000000"/>
-          <w:sz w:val="24"/>
-          <w:szCs w:val="24"/>
-          <w:u w:val="none"/>
-          <w:shd w:fill="auto" w:val="clear"/>
-          <w:vertAlign w:val="baseline"/>
-        </w:rPr>
-      </w:pPr>
-      <w:r>
-        <w:rPr>
-          <w:rFonts w:ascii="Liberation Serif" w:cs="Liberation Serif" w:eastAsia="Liberation Serif" w:hAnsi="Liberation Serif"/>
-          <w:b w:val="0"/>
-          <w:bCs w:val="0"/>
-          <w:i w:val="0"/>
-          <w:iCs w:val="0"/>
-          <w:smallCaps w:val="0"/>
-          <w:strike w:val="0"/>
-          <w:color w:val="000000"/>
-          <w:sz w:val="24"/>
-          <w:szCs w:val="24"/>
-          <w:u w:val="none"/>
-          <w:shd w:fill="auto" w:val="clear"/>
-          <w:vertAlign w:val="baseline"/>
+        <w:spacing w:after="140" w:line="276" w:lineRule="auto"/>
+        <w:ind w:left="709" w:hanging="283"/>
+        <w:rPr>
+          <w:b w:val="0"/>
+          <w:bCs w:val="0"/>
+          <w:sz w:val="24"/>
+          <w:szCs w:val="24"/>
+        </w:rPr>
+      </w:pPr>
+      <w:r>
+        <w:rPr>
           <w:rtl w:val="0"/>
         </w:rPr>
         <w:t xml:space="preserve">Response:</w:t>
@@ -1721,6 +1248,19 @@
         <w:br w:type="textWrapping"/>
         <w:t xml:space="preserve">}</w:t>
       </w:r>
+      <w:r>
+        <w:rPr>
+          <w:rtl w:val="0"/>
+        </w:rPr>
+      </w:r>
+    </w:p>
+    <w:p>
+      <w:pPr>
+        <w:spacing w:after="140" w:line="276" w:lineRule="auto"/>
+        <w:rPr>
+          <w:rFonts w:ascii="Liberation Mono" w:cs="Liberation Mono" w:eastAsia="Liberation Mono" w:hAnsi="Liberation Mono"/>
+        </w:rPr>
+      </w:pPr>
       <w:r>
         <w:rPr>
           <w:rtl w:val="0"/>
@@ -1740,23 +1280,7 @@
       </w:pPr>
       <w:r>
         <w:rPr>
-          <w:rtl w:val="0"/>
-        </w:rPr>
-      </w:r>
-    </w:p>
-    <w:p>
-      <w:pPr>
-        <w:pStyle w:val="Heading2"/>
-        <w:numPr>
-          <w:ilvl w:val="1"/>
-          <w:numId w:val="1"/>
-        </w:numPr>
-        <w:spacing w:line="276" w:lineRule="auto"/>
-        <w:ind w:left="0" w:firstLine="0"/>
-        <w:rPr/>
-      </w:pPr>
-      <w:r>
-        <w:rPr>
+          <w:u w:val="single"/>
           <w:rtl w:val="0"/>
         </w:rPr>
         <w:t xml:space="preserve">Environment</w:t>
@@ -1893,6 +1417,30 @@
     </w:p>
     <w:p>
       <w:pPr>
+        <w:shd w:fill="e8eaf6" w:val="clear"/>
+        <w:spacing w:after="283" w:line="276" w:lineRule="auto"/>
+        <w:rPr/>
+      </w:pPr>
+      <w:r>
+        <w:rPr>
+          <w:rFonts w:ascii="Courier New" w:cs="Courier New" w:eastAsia="Courier New" w:hAnsi="Courier New"/>
+          <w:color w:val="333333"/>
+          <w:sz w:val="20"/>
+          <w:szCs w:val="20"/>
+          <w:rtl w:val="0"/>
+        </w:rPr>
+        <w:t xml:space="preserve">FOUNDRY_MODEL="grok-4.3" `</w:t>
+        <w:br w:type="textWrapping"/>
+        <w:t xml:space="preserve">  FOUNDRY_PROJECT_ENDPOINT="https://your-resource-group.services.ai.azure.com/api/projects/obs-test-resource"</w:t>
+      </w:r>
+      <w:r>
+        <w:rPr>
+          <w:rtl w:val="0"/>
+        </w:rPr>
+      </w:r>
+    </w:p>
+    <w:p>
+      <w:pPr>
         <w:keepNext w:val="0"/>
         <w:keepLines w:val="0"/>
         <w:pageBreakBefore w:val="0"/>
@@ -1908,116 +1456,12 @@
         <w:spacing w:after="140" w:before="0" w:line="276" w:lineRule="auto"/>
         <w:ind w:left="0" w:right="0" w:firstLine="0"/>
         <w:jc w:val="left"/>
-        <w:rPr>
-          <w:rFonts w:ascii="Liberation Serif" w:cs="Liberation Serif" w:eastAsia="Liberation Serif" w:hAnsi="Liberation Serif"/>
-          <w:b w:val="0"/>
-          <w:bCs w:val="0"/>
-          <w:i w:val="0"/>
-          <w:iCs w:val="0"/>
-          <w:smallCaps w:val="0"/>
-          <w:strike w:val="0"/>
-          <w:color w:val="000000"/>
-          <w:sz w:val="24"/>
-          <w:szCs w:val="24"/>
-          <w:u w:val="none"/>
-          <w:shd w:fill="auto" w:val="clear"/>
-          <w:vertAlign w:val="baseline"/>
-        </w:rPr>
-      </w:pPr>
-      <w:r>
-        <w:rPr>
-          <w:rFonts w:ascii="Liberation Serif" w:cs="Liberation Serif" w:eastAsia="Liberation Serif" w:hAnsi="Liberation Serif"/>
-          <w:b w:val="0"/>
-          <w:bCs w:val="0"/>
-          <w:i w:val="0"/>
-          <w:iCs w:val="0"/>
-          <w:smallCaps w:val="0"/>
-          <w:strike w:val="0"/>
-          <w:color w:val="000000"/>
-          <w:sz w:val="24"/>
-          <w:szCs w:val="24"/>
-          <w:u w:val="none"/>
-          <w:shd w:fill="auto" w:val="clear"/>
-          <w:vertAlign w:val="baseline"/>
-          <w:rtl w:val="0"/>
-        </w:rPr>
-        <w:t xml:space="preserve">For the sample client in this folder, set </w:t>
-      </w:r>
-      <w:r>
-        <w:rPr>
-          <w:rFonts w:ascii="Liberation Mono" w:cs="Liberation Mono" w:eastAsia="Liberation Mono" w:hAnsi="Liberation Mono"/>
-          <w:b w:val="0"/>
-          <w:bCs w:val="0"/>
-          <w:i w:val="0"/>
-          <w:iCs w:val="0"/>
-          <w:smallCaps w:val="0"/>
-          <w:strike w:val="0"/>
-          <w:color w:val="000000"/>
-          <w:sz w:val="24"/>
-          <w:szCs w:val="24"/>
-          <w:u w:val="none"/>
-          <w:shd w:fill="auto" w:val="clear"/>
-          <w:vertAlign w:val="baseline"/>
-          <w:rtl w:val="0"/>
-        </w:rPr>
-        <w:t xml:space="preserve">AGUI_SERVER_URL</w:t>
-      </w:r>
-      <w:r>
-        <w:rPr>
-          <w:rFonts w:ascii="Liberation Serif" w:cs="Liberation Serif" w:eastAsia="Liberation Serif" w:hAnsi="Liberation Serif"/>
-          <w:b w:val="0"/>
-          <w:bCs w:val="0"/>
-          <w:i w:val="0"/>
-          <w:iCs w:val="0"/>
-          <w:smallCaps w:val="0"/>
-          <w:strike w:val="0"/>
-          <w:color w:val="000000"/>
-          <w:sz w:val="24"/>
-          <w:szCs w:val="24"/>
-          <w:u w:val="none"/>
-          <w:shd w:fill="auto" w:val="clear"/>
-          <w:vertAlign w:val="baseline"/>
-          <w:rtl w:val="0"/>
-        </w:rPr>
-        <w:t xml:space="preserve"> to </w:t>
-      </w:r>
-      <w:r>
-        <w:rPr>
-          <w:rFonts w:ascii="Liberation Mono" w:cs="Liberation Mono" w:eastAsia="Liberation Mono" w:hAnsi="Liberation Mono"/>
-          <w:b w:val="0"/>
-          <w:bCs w:val="0"/>
-          <w:i w:val="0"/>
-          <w:iCs w:val="0"/>
-          <w:smallCaps w:val="0"/>
-          <w:strike w:val="0"/>
-          <w:color w:val="000000"/>
-          <w:sz w:val="24"/>
-          <w:szCs w:val="24"/>
-          <w:u w:val="none"/>
-          <w:shd w:fill="auto" w:val="clear"/>
-          <w:vertAlign w:val="baseline"/>
-          <w:rtl w:val="0"/>
-        </w:rPr>
-        <w:t xml:space="preserve">http://127.0.0.1:8000/chat</w:t>
-      </w:r>
-      <w:r>
-        <w:rPr>
-          <w:rFonts w:ascii="Liberation Serif" w:cs="Liberation Serif" w:eastAsia="Liberation Serif" w:hAnsi="Liberation Serif"/>
-          <w:b w:val="0"/>
-          <w:bCs w:val="0"/>
-          <w:i w:val="0"/>
-          <w:iCs w:val="0"/>
-          <w:smallCaps w:val="0"/>
-          <w:strike w:val="0"/>
-          <w:color w:val="000000"/>
-          <w:sz w:val="24"/>
-          <w:szCs w:val="24"/>
-          <w:u w:val="none"/>
-          <w:shd w:fill="auto" w:val="clear"/>
-          <w:vertAlign w:val="baseline"/>
-          <w:rtl w:val="0"/>
-        </w:rPr>
-        <w:t xml:space="preserve">.</w:t>
+        <w:rPr/>
+      </w:pPr>
+      <w:r>
+        <w:rPr>
+          <w:rtl w:val="0"/>
+        </w:rPr>
       </w:r>
     </w:p>
     <w:p>
@@ -2035,7 +1479,7 @@
         <w:rPr>
           <w:rtl w:val="0"/>
         </w:rPr>
-        <w:t xml:space="preserve">Container Notes</w:t>
+        <w:t xml:space="preserve">2. Container Notes</w:t>
       </w:r>
     </w:p>
     <w:p>
@@ -2255,10 +1699,16 @@
         </w:numPr>
         <w:spacing w:line="276" w:lineRule="auto"/>
         <w:ind w:left="0" w:firstLine="0"/>
-        <w:rPr/>
-      </w:pPr>
-      <w:r>
-        <w:rPr>
+        <w:rPr>
+          <w:sz w:val="28"/>
+          <w:szCs w:val="28"/>
+        </w:rPr>
+      </w:pPr>
+      <w:r>
+        <w:rPr>
+          <w:sz w:val="28"/>
+          <w:szCs w:val="28"/>
+          <w:u w:val="single"/>
           <w:rtl w:val="0"/>
         </w:rPr>
         <w:t xml:space="preserve">Docker Files Created (3 Files)</w:t>
@@ -2785,10 +2235,17 @@
         <w:pStyle w:val="Heading2"/>
         <w:spacing w:line="276" w:lineRule="auto"/>
         <w:ind w:left="0" w:firstLine="0"/>
-        <w:rPr/>
-      </w:pPr>
-      <w:r>
-        <w:rPr>
+        <w:rPr>
+          <w:sz w:val="28"/>
+          <w:szCs w:val="28"/>
+          <w:u w:val="single"/>
+        </w:rPr>
+      </w:pPr>
+      <w:r>
+        <w:rPr>
+          <w:sz w:val="28"/>
+          <w:szCs w:val="28"/>
+          <w:u w:val="single"/>
           <w:rtl w:val="0"/>
         </w:rPr>
         <w:t xml:space="preserve">Run As A Docker Container</w:t>
@@ -3027,24 +2484,24 @@
         <w:spacing w:line="276" w:lineRule="auto"/>
         <w:rPr/>
       </w:pPr>
-      <w:bookmarkStart w:colFirst="0" w:colLast="0" w:name="_mc136jaunq70" w:id="2"/>
-      <w:bookmarkEnd w:id="2"/>
+      <w:bookmarkStart w:colFirst="0" w:colLast="0" w:name="_mc136jaunq70" w:id="3"/>
+      <w:bookmarkEnd w:id="3"/>
       <w:r>
         <w:rPr/>
         <w:drawing>
           <wp:inline distB="114300" distT="114300" distL="114300" distR="114300">
             <wp:extent cx="6124575" cy="1455767"/>
             <wp:effectExtent b="0" l="0" r="0" t="0"/>
-            <wp:docPr id="2" name="image1.jpg"/>
+            <wp:docPr id="2" name="image2.jpg"/>
             <a:graphic>
               <a:graphicData uri="http://schemas.openxmlformats.org/drawingml/2006/picture">
                 <pic:pic>
                   <pic:nvPicPr>
-                    <pic:cNvPr id="0" name="image1.jpg"/>
+                    <pic:cNvPr id="0" name="image2.jpg"/>
                     <pic:cNvPicPr preferRelativeResize="0"/>
                   </pic:nvPicPr>
                   <pic:blipFill>
-                    <a:blip r:embed="rId8"/>
+                    <a:blip r:embed="rId7"/>
                     <a:srcRect b="29401" l="0" r="0" t="34870"/>
                     <a:stretch>
                       <a:fillRect/>
@@ -3081,6 +2538,12 @@
         <w:ind w:left="0" w:firstLine="0"/>
         <w:rPr/>
       </w:pPr>
+      <w:r>
+        <w:rPr>
+          <w:rtl w:val="0"/>
+        </w:rPr>
+        <w:t xml:space="preserve">3. </w:t>
+      </w:r>
       <w:r>
         <w:rPr>
           <w:rtl w:val="0"/>
@@ -3673,7 +3136,7 @@
         <w:br w:type="textWrapping"/>
         <w:t xml:space="preserve">    FOUNDRY_MODEL="grok-4.3" `</w:t>
         <w:br w:type="textWrapping"/>
-        <w:t xml:space="preserve">    FOUNDRY_PROJECT_ENDPOINT="https://obs-test-resource-resource.services.ai.azure.com/api/projects/obs-test-resource" `</w:t>
+        <w:t xml:space="preserve">    FOUNDRY_PROJECT_ENDPOINT="https://your-resource-group.services.ai.azure.com/api/projects/your-project-name" `</w:t>
         <w:br w:type="textWrapping"/>
         <w:t xml:space="preserve">    AZURE_TENANT_ID="&lt;tenant-id&gt;" `</w:t>
         <w:br w:type="textWrapping"/>
@@ -3713,10 +3176,16 @@
         </w:numPr>
         <w:spacing w:line="276" w:lineRule="auto"/>
         <w:ind w:left="0" w:firstLine="0"/>
-        <w:rPr/>
-      </w:pPr>
-      <w:r>
-        <w:rPr>
+        <w:rPr>
+          <w:sz w:val="28"/>
+          <w:szCs w:val="28"/>
+        </w:rPr>
+      </w:pPr>
+      <w:r>
+        <w:rPr>
+          <w:sz w:val="28"/>
+          <w:szCs w:val="28"/>
+          <w:u w:val="single"/>
           <w:rtl w:val="0"/>
         </w:rPr>
         <w:t xml:space="preserve">Managed Identity (Recommended For Azure)</w:t>
@@ -3731,15 +3200,15 @@
         </w:numPr>
         <w:spacing w:line="276" w:lineRule="auto"/>
       </w:pPr>
-      <w:bookmarkStart w:colFirst="0" w:colLast="0" w:name="_53ooe23qub9" w:id="3"/>
-      <w:bookmarkEnd w:id="3"/>
+      <w:bookmarkStart w:colFirst="0" w:colLast="0" w:name="_53ooe23qub9" w:id="4"/>
+      <w:bookmarkEnd w:id="4"/>
       <w:r>
         <w:rPr/>
         <w:drawing>
           <wp:inline distB="114300" distT="114300" distL="114300" distR="114300">
             <wp:extent cx="6124575" cy="1473408"/>
             <wp:effectExtent b="0" l="0" r="0" t="0"/>
-            <wp:docPr id="4" name="image3.jpg"/>
+            <wp:docPr id="3" name="image3.jpg"/>
             <a:graphic>
               <a:graphicData uri="http://schemas.openxmlformats.org/drawingml/2006/picture">
                 <pic:pic>
@@ -3748,7 +3217,7 @@
                     <pic:cNvPicPr preferRelativeResize="0"/>
                   </pic:nvPicPr>
                   <pic:blipFill>
-                    <a:blip r:embed="rId7"/>
+                    <a:blip r:embed="rId8"/>
                     <a:srcRect b="0" l="0" r="0" t="63858"/>
                     <a:stretch>
                       <a:fillRect/>
@@ -4179,7 +3648,7 @@
         <w:br w:type="textWrapping"/>
         <w:t xml:space="preserve">    FOUNDRY_MODEL="grok-4.3" `</w:t>
         <w:br w:type="textWrapping"/>
-        <w:t xml:space="preserve">    FOUNDRY_PROJECT_ENDPOINT="https://obs-test-resource-resource.services.ai.azure.com/api/projects/obs-test-resource"</w:t>
+        <w:t xml:space="preserve">    FOUNDRY_PROJECT_ENDPOINT="https://your-resource-group.services.ai.azure.com/api/projects/your-project"</w:t>
       </w:r>
       <w:r>
         <w:rPr>
@@ -4371,42 +3840,6 @@
         <w:ind w:left="0" w:right="0" w:firstLine="0"/>
         <w:jc w:val="left"/>
         <w:rPr>
-          <w:rFonts w:ascii="Liberation Serif" w:cs="Liberation Serif" w:eastAsia="Liberation Serif" w:hAnsi="Liberation Serif"/>
-          <w:b w:val="0"/>
-          <w:bCs w:val="0"/>
-          <w:i w:val="0"/>
-          <w:iCs w:val="0"/>
-          <w:smallCaps w:val="0"/>
-          <w:strike w:val="0"/>
-          <w:color w:val="000000"/>
-          <w:sz w:val="24"/>
-          <w:szCs w:val="24"/>
-          <w:u w:val="none"/>
-          <w:shd w:fill="auto" w:val="clear"/>
-          <w:vertAlign w:val="baseline"/>
-        </w:rPr>
-      </w:pPr>
-      <w:r>
-        <w:rPr>
-          <w:rFonts w:ascii="Liberation Serif" w:cs="Liberation Serif" w:eastAsia="Liberation Serif" w:hAnsi="Liberation Serif"/>
-          <w:b w:val="0"/>
-          <w:bCs w:val="0"/>
-          <w:i w:val="0"/>
-          <w:iCs w:val="0"/>
-          <w:smallCaps w:val="0"/>
-          <w:strike w:val="0"/>
-          <w:color w:val="000000"/>
-          <w:sz w:val="24"/>
-          <w:szCs w:val="24"/>
-          <w:u w:val="none"/>
-          <w:shd w:fill="auto" w:val="clear"/>
-          <w:vertAlign w:val="baseline"/>
-          <w:rtl w:val="0"/>
-        </w:rPr>
-        <w:t xml:space="preserve">For AG-UI clients, set </w:t>
-      </w:r>
-      <w:r>
-        <w:rPr>
           <w:rFonts w:ascii="Liberation Mono" w:cs="Liberation Mono" w:eastAsia="Liberation Mono" w:hAnsi="Liberation Mono"/>
           <w:b w:val="0"/>
           <w:bCs w:val="0"/>
@@ -4420,28 +3853,12 @@
           <w:u w:val="none"/>
           <w:shd w:fill="auto" w:val="clear"/>
           <w:vertAlign w:val="baseline"/>
-          <w:rtl w:val="0"/>
-        </w:rPr>
-        <w:t xml:space="preserve">AGUI_SERVER_URL</w:t>
-      </w:r>
-      <w:r>
-        <w:rPr>
-          <w:rFonts w:ascii="Liberation Serif" w:cs="Liberation Serif" w:eastAsia="Liberation Serif" w:hAnsi="Liberation Serif"/>
-          <w:b w:val="0"/>
-          <w:bCs w:val="0"/>
-          <w:i w:val="0"/>
-          <w:iCs w:val="0"/>
-          <w:smallCaps w:val="0"/>
-          <w:strike w:val="0"/>
-          <w:color w:val="000000"/>
-          <w:sz w:val="24"/>
-          <w:szCs w:val="24"/>
-          <w:u w:val="none"/>
-          <w:shd w:fill="auto" w:val="clear"/>
-          <w:vertAlign w:val="baseline"/>
-          <w:rtl w:val="0"/>
-        </w:rPr>
-        <w:t xml:space="preserve"> to:</w:t>
+        </w:rPr>
+      </w:pPr>
+      <w:r>
+        <w:rPr>
+          <w:rtl w:val="0"/>
+        </w:rPr>
       </w:r>
     </w:p>
     <w:p>
@@ -4462,79 +3879,220 @@
         <w:ind w:left="0" w:right="0" w:firstLine="0"/>
         <w:jc w:val="left"/>
         <w:rPr>
-          <w:rFonts w:ascii="Liberation Serif" w:cs="Liberation Serif" w:eastAsia="Liberation Serif" w:hAnsi="Liberation Serif"/>
-          <w:b w:val="0"/>
-          <w:bCs w:val="0"/>
-          <w:i w:val="0"/>
-          <w:iCs w:val="0"/>
-          <w:smallCaps w:val="0"/>
-          <w:strike w:val="0"/>
-          <w:color w:val="000000"/>
-          <w:sz w:val="24"/>
-          <w:szCs w:val="24"/>
-          <w:u w:val="none"/>
-          <w:shd w:fill="auto" w:val="clear"/>
-          <w:vertAlign w:val="baseline"/>
-        </w:rPr>
-      </w:pPr>
-      <w:r>
-        <w:rPr>
           <w:rFonts w:ascii="Liberation Mono" w:cs="Liberation Mono" w:eastAsia="Liberation Mono" w:hAnsi="Liberation Mono"/>
-          <w:b w:val="0"/>
-          <w:bCs w:val="0"/>
-          <w:i w:val="0"/>
-          <w:iCs w:val="0"/>
-          <w:smallCaps w:val="0"/>
-          <w:strike w:val="0"/>
-          <w:color w:val="000000"/>
-          <w:sz w:val="24"/>
-          <w:szCs w:val="24"/>
-          <w:u w:val="none"/>
-          <w:shd w:fill="auto" w:val="clear"/>
-          <w:vertAlign w:val="baseline"/>
+        </w:rPr>
+      </w:pPr>
+      <w:r>
+        <w:rPr>
+          <w:rtl w:val="0"/>
+        </w:rPr>
+      </w:r>
+    </w:p>
+    <w:p>
+      <w:pPr>
+        <w:pStyle w:val="Heading3"/>
+        <w:numPr>
+          <w:ilvl w:val="2"/>
+          <w:numId w:val="1"/>
+        </w:numPr>
+        <w:spacing w:line="276" w:lineRule="auto"/>
+        <w:rPr>
+          <w:rFonts w:ascii="Liberation Sans" w:cs="Liberation Sans" w:eastAsia="Liberation Sans" w:hAnsi="Liberation Sans"/>
+          <w:b w:val="1"/>
+          <w:bCs w:val="1"/>
+          <w:sz w:val="32"/>
+          <w:szCs w:val="32"/>
+        </w:rPr>
+      </w:pPr>
+      <w:r>
+        <w:rPr>
+          <w:sz w:val="32"/>
+          <w:szCs w:val="32"/>
+          <w:rtl w:val="0"/>
+        </w:rPr>
+        <w:t xml:space="preserve">4. Agent User-Interaction Protocol</w:t>
+      </w:r>
+    </w:p>
+    <w:p>
+      <w:pPr>
+        <w:numPr>
+          <w:ilvl w:val="0"/>
+          <w:numId w:val="4"/>
+        </w:numPr>
+        <w:tabs>
+          <w:tab w:val="left" w:leader="none" w:pos="709"/>
+        </w:tabs>
+        <w:spacing w:after="140" w:line="276" w:lineRule="auto"/>
+        <w:ind w:left="709" w:hanging="283"/>
+      </w:pPr>
+      <w:r>
+        <w:rPr>
+          <w:rtl w:val="0"/>
+        </w:rPr>
+        <w:t xml:space="preserve">Method: </w:t>
+      </w:r>
+      <w:r>
+        <w:rPr>
+          <w:rFonts w:ascii="Liberation Mono" w:cs="Liberation Mono" w:eastAsia="Liberation Mono" w:hAnsi="Liberation Mono"/>
+          <w:rtl w:val="0"/>
+        </w:rPr>
+        <w:t xml:space="preserve">POST</w:t>
+      </w:r>
+      <w:r>
+        <w:rPr>
+          <w:rtl w:val="0"/>
+        </w:rPr>
+      </w:r>
+    </w:p>
+    <w:p>
+      <w:pPr>
+        <w:numPr>
+          <w:ilvl w:val="0"/>
+          <w:numId w:val="4"/>
+        </w:numPr>
+        <w:tabs>
+          <w:tab w:val="left" w:leader="none" w:pos="709"/>
+        </w:tabs>
+        <w:spacing w:after="140" w:line="276" w:lineRule="auto"/>
+        <w:ind w:left="709" w:hanging="283"/>
+      </w:pPr>
+      <w:r>
+        <w:rPr>
+          <w:rtl w:val="0"/>
+        </w:rPr>
+        <w:t xml:space="preserve">URL: </w:t>
+      </w:r>
+      <w:r>
+        <w:rPr>
+          <w:rFonts w:ascii="Liberation Mono" w:cs="Liberation Mono" w:eastAsia="Liberation Mono" w:hAnsi="Liberation Mono"/>
+          <w:rtl w:val="0"/>
+        </w:rPr>
+        <w:t xml:space="preserve">/chat</w:t>
+      </w:r>
+      <w:r>
+        <w:rPr>
+          <w:rtl w:val="0"/>
+        </w:rPr>
+      </w:r>
+    </w:p>
+    <w:p>
+      <w:pPr>
+        <w:numPr>
+          <w:ilvl w:val="0"/>
+          <w:numId w:val="4"/>
+        </w:numPr>
+        <w:tabs>
+          <w:tab w:val="left" w:leader="none" w:pos="709"/>
+        </w:tabs>
+        <w:spacing w:after="140" w:line="276" w:lineRule="auto"/>
+        <w:ind w:left="709" w:hanging="283"/>
+      </w:pPr>
+      <w:r>
+        <w:rPr>
+          <w:rtl w:val="0"/>
+        </w:rPr>
+        <w:t xml:space="preserve">Protocol: Server-Sent Events for </w:t>
+      </w:r>
+      <w:r>
+        <w:rPr>
+          <w:rFonts w:ascii="Liberation Mono" w:cs="Liberation Mono" w:eastAsia="Liberation Mono" w:hAnsi="Liberation Mono"/>
+          <w:rtl w:val="0"/>
+        </w:rPr>
+        <w:t xml:space="preserve">AGUIChatClient</w:t>
+      </w:r>
+      <w:r>
+        <w:rPr>
+          <w:rtl w:val="0"/>
+        </w:rPr>
+        <w:t xml:space="preserve">.</w:t>
+      </w:r>
+    </w:p>
+    <w:p>
+      <w:pPr>
+        <w:pStyle w:val="Heading2"/>
+        <w:spacing w:line="276" w:lineRule="auto"/>
+        <w:rPr/>
+      </w:pPr>
+      <w:bookmarkStart w:colFirst="0" w:colLast="0" w:name="_istvrb9bvscs" w:id="5"/>
+      <w:bookmarkEnd w:id="5"/>
+      <w:r>
+        <w:rPr/>
+        <w:drawing>
+          <wp:inline distB="114300" distT="114300" distL="114300" distR="114300">
+            <wp:extent cx="6119820" cy="2603500"/>
+            <wp:effectExtent b="0" l="0" r="0" t="0"/>
+            <wp:docPr id="4" name="image3.jpg"/>
+            <a:graphic>
+              <a:graphicData uri="http://schemas.openxmlformats.org/drawingml/2006/picture">
+                <pic:pic>
+                  <pic:nvPicPr>
+                    <pic:cNvPr id="0" name="image3.jpg"/>
+                    <pic:cNvPicPr preferRelativeResize="0"/>
+                  </pic:nvPicPr>
+                  <pic:blipFill>
+                    <a:blip r:embed="rId8"/>
+                    <a:srcRect b="35982" l="0" r="0" t="0"/>
+                    <a:stretch>
+                      <a:fillRect/>
+                    </a:stretch>
+                  </pic:blipFill>
+                  <pic:spPr>
+                    <a:xfrm>
+                      <a:off x="0" y="0"/>
+                      <a:ext cx="6119820" cy="2603500"/>
+                    </a:xfrm>
+                    <a:prstGeom prst="rect"/>
+                    <a:ln/>
+                  </pic:spPr>
+                </pic:pic>
+              </a:graphicData>
+            </a:graphic>
+          </wp:inline>
+        </w:drawing>
+      </w:r>
+      <w:r>
+        <w:rPr>
+          <w:rtl w:val="0"/>
+        </w:rPr>
+      </w:r>
+    </w:p>
+    <w:p>
+      <w:pPr>
+        <w:spacing w:after="140" w:line="276" w:lineRule="auto"/>
+        <w:rPr/>
+      </w:pPr>
+      <w:r>
+        <w:rPr>
+          <w:rtl w:val="0"/>
+        </w:rPr>
+        <w:t xml:space="preserve">For AG-UI clients, set </w:t>
+      </w:r>
+      <w:r>
+        <w:rPr>
+          <w:rFonts w:ascii="Liberation Mono" w:cs="Liberation Mono" w:eastAsia="Liberation Mono" w:hAnsi="Liberation Mono"/>
+          <w:rtl w:val="0"/>
+        </w:rPr>
+        <w:t xml:space="preserve">AGUI_SERVER_URL in .env</w:t>
+      </w:r>
+      <w:r>
+        <w:rPr>
+          <w:rtl w:val="0"/>
+        </w:rPr>
+        <w:t xml:space="preserve"> to:</w:t>
+      </w:r>
+    </w:p>
+    <w:p>
+      <w:pPr>
+        <w:spacing w:after="140" w:line="276" w:lineRule="auto"/>
+        <w:rPr/>
+      </w:pPr>
+      <w:r>
+        <w:rPr>
+          <w:rFonts w:ascii="Liberation Mono" w:cs="Liberation Mono" w:eastAsia="Liberation Mono" w:hAnsi="Liberation Mono"/>
           <w:rtl w:val="0"/>
         </w:rPr>
         <w:t xml:space="preserve">https://&lt;your-container-app-fqdn&gt;/chat</w:t>
       </w:r>
-      <w:r>
-        <w:rPr>
-          <w:rtl w:val="0"/>
-        </w:rPr>
-      </w:r>
-    </w:p>
-    <w:p>
-      <w:pPr>
-        <w:keepNext w:val="0"/>
-        <w:keepLines w:val="0"/>
-        <w:pageBreakBefore w:val="0"/>
-        <w:widowControl w:val="0"/>
-        <w:pBdr>
-          <w:top w:space="0" w:sz="0" w:val="nil"/>
-          <w:left w:space="0" w:sz="0" w:val="nil"/>
-          <w:bottom w:space="0" w:sz="0" w:val="nil"/>
-          <w:right w:space="0" w:sz="0" w:val="nil"/>
-          <w:between w:space="0" w:sz="0" w:val="nil"/>
-        </w:pBdr>
-        <w:shd w:fill="auto" w:val="clear"/>
-        <w:spacing w:after="140" w:before="0" w:line="276" w:lineRule="auto"/>
-        <w:ind w:left="0" w:right="0" w:firstLine="0"/>
-        <w:jc w:val="left"/>
-        <w:rPr>
-          <w:rFonts w:ascii="Liberation Serif" w:cs="Liberation Serif" w:eastAsia="Liberation Serif" w:hAnsi="Liberation Serif"/>
-          <w:b w:val="0"/>
-          <w:bCs w:val="0"/>
-          <w:i w:val="0"/>
-          <w:iCs w:val="0"/>
-          <w:smallCaps w:val="0"/>
-          <w:strike w:val="0"/>
-          <w:color w:val="000000"/>
-          <w:sz w:val="24"/>
-          <w:szCs w:val="24"/>
-          <w:u w:val="none"/>
-          <w:shd w:fill="auto" w:val="clear"/>
-          <w:vertAlign w:val="baseline"/>
-        </w:rPr>
-      </w:pPr>
       <w:r>
         <w:rPr>
           <w:rtl w:val="0"/>

</xml_diff>